<commit_message>
Deliverables for Day 5 of RSI_Two_Week_Workplan.docx completed.
</commit_message>
<xml_diff>
--- a/docs/RSI_Two_Week_Workplan.docx
+++ b/docs/RSI_Two_Week_Workplan.docx
@@ -1,6 +1,6 @@
 
 <file path=word/document.xml><?xml version="1.0" encoding="utf-8"?>
-<w:document xmlns:wpc="http://schemas.microsoft.com/office/word/2010/wordprocessingCanvas" xmlns:mo="http://schemas.microsoft.com/office/mac/office/2008/main" xmlns:mc="http://schemas.openxmlformats.org/markup-compatibility/2006" xmlns:mv="urn:schemas-microsoft-com:mac:vml" xmlns:o="urn:schemas-microsoft-com:office:office" xmlns:r="http://schemas.openxmlformats.org/officeDocument/2006/relationships" xmlns:m="http://schemas.openxmlformats.org/officeDocument/2006/math" xmlns:v="urn:schemas-microsoft-com:vml" xmlns:wp14="http://schemas.microsoft.com/office/word/2010/wordprocessingDrawing" xmlns:wp="http://schemas.openxmlformats.org/drawingml/2006/wordprocessingDrawing" xmlns:w10="urn:schemas-microsoft-com:office:word" xmlns:w="http://schemas.openxmlformats.org/wordprocessingml/2006/main" xmlns:w14="http://schemas.microsoft.com/office/word/2010/wordml" xmlns:wpg="http://schemas.microsoft.com/office/word/2010/wordprocessingGroup" xmlns:wpi="http://schemas.microsoft.com/office/word/2010/wordprocessingInk" xmlns:wne="http://schemas.microsoft.com/office/word/2006/wordml" xmlns:wps="http://schemas.microsoft.com/office/word/2010/wordprocessingShape" mc:Ignorable="w14 wp14">
+<w:document xmlns:ns1="http://schemas.openxmlformats.org/markup-compatibility/2006" xmlns:r="http://schemas.openxmlformats.org/officeDocument/2006/relationships" xmlns:w="http://schemas.openxmlformats.org/wordprocessingml/2006/main" ns1:Ignorable="w14 wp14">
   <w:body>
     <w:p>
       <w:pPr>
@@ -157,11 +157,8 @@
       </w:r>
     </w:p>
     <w:p>
-      <w:pPr>
-        <w:pStyle w:val="ListBullet"/>
-      </w:pPr>
       <w:r>
-        <w:t>The UI is developed only to the point needed for submission evidence: real device status, configuration loading, timing recipe application/readback, MUX/Pico diagnostics, HF2LI acquisition, MIRcat/QCL state handling, a controlled pump-probe run, emergency stop, and run manifests.</w:t>
+        <w:t>The UI is developed only to the point needed for submission evidence: real device status, configuration loading, timing recipe application/readback, MUX/Pico diagnostics, HF2LI acquisition, MIRcat/QCL state handling, a controlled pump-probe run, emergency stop, and run manifests. The final UI target is a packaged Windows desktop application composed from independent device widgets tied together by workflow routines; Day 5 widgets must be foldable into that unified interface with minimal refactoring.</w:t>
       </w:r>
     </w:p>
     <w:p>
@@ -181,11 +178,8 @@
       </w:r>
     </w:p>
     <w:p>
-      <w:pPr>
-        <w:pStyle w:val="ListBullet"/>
-      </w:pPr>
       <w:r>
-        <w:t>No UI callback calls an SDK, serial port, TCP socket, or LabOne node directly. UI callbacks dispatch named workflow commands only.</w:t>
+        <w:t>No UI callback or device widget calls an SDK, serial port, TCP socket, or LabOne node directly. UI callbacks and widgets dispatch named workflow commands only.</w:t>
       </w:r>
     </w:p>
     <w:p>
@@ -871,13 +865,8 @@
             <w:vAlign w:val="top"/>
           </w:tcPr>
           <w:p>
-            <w:r/>
             <w:r>
-              <w:rPr>
-                <w:b w:val="0"/>
-                <w:sz w:val="16"/>
-              </w:rPr>
-              <w:t>Initialize SDK, check interlock/key switch, arm/wait for TEC readiness, tune setpoint, poll actual wavelength, control emission as permitted, cancel manual tune, and disarm.</w:t>
+              <w:t>Reusable MIRcat device widget for the Windows desktop UI: initialize SDK, check interlock/key switch, arm/wait for TEC readiness, expose operator parameter inputs, tune setpoint, poll actual wavelength, control emission only as permitted, cancel manual tune, disarm, and report exclusive-connection blockers when the manufacturer MIRcat UI owns the controller.</w:t>
             </w:r>
           </w:p>
         </w:tc>
@@ -2468,19 +2457,13 @@
       </w:r>
     </w:p>
     <w:p>
-      <w:pPr>
-        <w:pStyle w:val="ListBullet"/>
-      </w:pPr>
       <w:r>
-        <w:t>Add a MIRcat Status UI page showing only connected, API version, interlock, key switch, armed, TEC ready, set wavelength, actual wavelength, light-valid flag if available, emission state, current scan/manual-tune state, last SDK return code, and last error.</w:t>
+        <w:t>Add a reusable MIRcat Status/Control widget for the planned PySide6/Qt Windows desktop UI. It must show connected, API version, interlock, key switch, armed, TEC ready, set wavelength, actual wavelength, light-valid flag if available, emission state, current scan/manual-tune state, last SDK return code, and last error; it must also expose operator inputs for wavelength/wavenumber, QCL, TEC/tune timeouts, poll interval, and guarded safety approval so the manufacturer MIRcat UI can remain closed during control.</w:t>
       </w:r>
     </w:p>
     <w:p>
-      <w:pPr>
-        <w:pStyle w:val="ListBullet"/>
-      </w:pPr>
       <w:r>
-        <w:t>Run a lab-approved safe-state sequence: initialize, query statuses, arm/wait, tune to lambda_mid, verify actual wavelength, keep emission off unless explicitly approved, cancel manual tune, disarm, deinitialize.</w:t>
+        <w:t>Run a lab-approved safe-state sequence with lambda_mid defaulting to 1858 cm^-1: close the manufacturer MIRcat UI, initialize, query statuses, arm/wait, tune to lambda_mid, verify actual wavelength, keep emission off unless explicitly approved, cancel manual tune, disarm, deinitialize.</w:t>
       </w:r>
     </w:p>
     <w:p>

</xml_diff>

<commit_message>
Deliverables completed up to and including Day 7. Real csv files kept from tests for reference.
</commit_message>
<xml_diff>
--- a/docs/RSI_Two_Week_Workplan.docx
+++ b/docs/RSI_Two_Week_Workplan.docx
@@ -129,7 +129,7 @@
         <w:pStyle w:val="ListBullet"/>
       </w:pPr>
       <w:r>
-        <w:t>hardware_configuration.yaml already exists and remains the source of truth for ports, baud rates, communication protocols, device IDs, signal names, T660 channel assignments, MUX routes, and acquisition channels. This plan reads and hashes it; it does not recreate it.</w:t>
+        <w:t>hardware_configuration.yaml already exists and remains the source of truth for ports, baud rates, communication protocols, device IDs, signal names, T660 channel assignments, direct timing routes, MUX route identity, and acquisition-channel capability contracts. Scenario-specific PicoScope capture settings live in editable recipe/profile files that are hashed and recorded in run manifests. This plan reads and hashes the hardware configuration; it does not recreate it.</w:t>
       </w:r>
     </w:p>
     <w:p>
@@ -158,7 +158,7 @@
     </w:p>
     <w:p>
       <w:r>
-        <w:t>The UI is developed only to the point needed for submission evidence: real device status, configuration loading, timing recipe application/readback, MUX/Pico diagnostics, HF2LI acquisition, MIRcat/QCL state handling, a controlled pump-probe run, emergency stop, and run manifests. The final UI target is a packaged Windows desktop application composed from independent device widgets tied together by workflow routines; Day 5 widgets must be foldable into that unified interface with minimal refactoring.</w:t>
+        <w:t>The UI is developed only to the point needed for submission evidence: real device status, configuration loading, timing recipe application/readback, independent Arduino MUX diagnostics, independent PicoScope settings/capture checks, HF2LI acquisition, MIRcat/QCL state handling, a controlled pump-probe run, emergency stop, and run manifests. The final UI target is a packaged Windows desktop application composed from independent device widgets tied together by workflow routines; Day 5 widgets must be foldable into that unified interface with minimal refactoring.</w:t>
       </w:r>
     </w:p>
     <w:p>
@@ -787,7 +787,7 @@
                 <w:b w:val="0"/>
                 <w:sz w:val="16"/>
               </w:rPr>
-              <w:t>MUX/Pico diagnostics</w:t>
+              <w:t>Independent Arduino MUX and PicoScope diagnostics</w:t>
             </w:r>
           </w:p>
         </w:tc>
@@ -900,7 +900,7 @@
                 <w:b w:val="0"/>
                 <w:sz w:val="16"/>
               </w:rPr>
-              <w:t>Select wavelength, delay list, acquisition duration/shot count, timing recipe, and MUX/Pico checkpoints; then run the article-relevant scan using real hardware.</w:t>
+              <w:t>Select wavelength, delay list, acquisition duration/shot count, timing recipe, Arduino MUX checkpoints, and PicoScope capture profile; then run the article-relevant scan using real hardware.</w:t>
             </w:r>
           </w:p>
         </w:tc>
@@ -1273,7 +1273,7 @@
                 <w:b w:val="0"/>
                 <w:sz w:val="14"/>
               </w:rPr>
-              <w:t>Control-software/method text drafted in RSI file; MUX/Pico diagnostic method drafted.</w:t>
+              <w:t>Control-software/method text drafted in RSI file; independent Arduino MUX and PicoScope diagnostic methods drafted.</w:t>
             </w:r>
           </w:p>
         </w:tc>
@@ -1383,12 +1383,7 @@
             <w:vAlign w:val="top"/>
           </w:tcPr>
           <w:p>
-            <w:r/>
             <w:r>
-              <w:rPr>
-                <w:b w:val="0"/>
-                <w:sz w:val="14"/>
-              </w:rPr>
               <w:t>Day 6 - Wed Jun 17</w:t>
             </w:r>
           </w:p>
@@ -1399,13 +1394,8 @@
             <w:vAlign w:val="top"/>
           </w:tcPr>
           <w:p>
-            <w:r/>
             <w:r>
-              <w:rPr>
-                <w:b w:val="0"/>
-                <w:sz w:val="14"/>
-              </w:rPr>
-              <w:t>Detector/HF2LI acquisition subsection and detector variables table saved under Article root.</w:t>
+              <w:t>HF2LI/detector variables table, Myoglobin-CO experiment design sheet, and Day 4 Arduino MUX and PicoScope blocker disposition saved.</w:t>
             </w:r>
           </w:p>
         </w:tc>
@@ -1415,13 +1405,8 @@
             <w:vAlign w:val="top"/>
           </w:tcPr>
           <w:p>
-            <w:r/>
             <w:r>
-              <w:rPr>
-                <w:b w:val="0"/>
-                <w:sz w:val="14"/>
-              </w:rPr>
-              <w:t>Real 60 s HF2LI record and settings snapshot.</w:t>
+              <w:t>Real 60 s HF2LI record, settings snapshot/reload check, and confirmed diagnostic route or blocker log.</w:t>
             </w:r>
           </w:p>
         </w:tc>
@@ -1431,13 +1416,8 @@
             <w:vAlign w:val="top"/>
           </w:tcPr>
           <w:p>
-            <w:r/>
             <w:r>
-              <w:rPr>
-                <w:b w:val="0"/>
-                <w:sz w:val="14"/>
-              </w:rPr>
-              <w:t>Settings reload exactly.</w:t>
+              <w:t>Protocol, route, and settings acceptance gates are frozen before article measurements.</w:t>
             </w:r>
           </w:p>
         </w:tc>
@@ -1449,12 +1429,7 @@
             <w:vAlign w:val="top"/>
           </w:tcPr>
           <w:p>
-            <w:r/>
             <w:r>
-              <w:rPr>
-                <w:b w:val="0"/>
-                <w:sz w:val="14"/>
-              </w:rPr>
               <w:t>Day 7 - Thu Jun 18</w:t>
             </w:r>
           </w:p>
@@ -1465,13 +1440,8 @@
             <w:vAlign w:val="top"/>
           </w:tcPr>
           <w:p>
-            <w:r/>
             <w:r>
-              <w:rPr>
-                <w:b w:val="0"/>
-                <w:sz w:val="14"/>
-              </w:rPr>
-              <w:t>Control architecture figure or screenshot exported to Article Figures only.</w:t>
+              <w:t>Control architecture/method text updated for workflow state machine plus Myoglobin-CO acquisition recipe/source-data template.</w:t>
             </w:r>
           </w:p>
         </w:tc>
@@ -1481,13 +1451,8 @@
             <w:vAlign w:val="top"/>
           </w:tcPr>
           <w:p>
-            <w:r/>
             <w:r>
-              <w:rPr>
-                <w:b w:val="0"/>
-                <w:sz w:val="14"/>
-              </w:rPr>
-              <w:t>Add-only workflow interface frozen and exercised on hardware.</w:t>
+              <w:t>Add-only UI workflow exercised from startup through safe shutdown with MIRcat/T660/Pico/HF2LI widgets connected only through workflows.</w:t>
             </w:r>
           </w:p>
         </w:tc>
@@ -1497,13 +1462,8 @@
             <w:vAlign w:val="top"/>
           </w:tcPr>
           <w:p>
-            <w:r/>
             <w:r>
-              <w:rPr>
-                <w:b w:val="0"/>
-                <w:sz w:val="14"/>
-              </w:rPr>
-              <w:t>No UI widget imports hardware libraries.</w:t>
+              <w:t>No direct UI hardware imports; Myoglobin-CO recipe dry-run or safe hardware exercise logged.</w:t>
             </w:r>
           </w:p>
         </w:tc>
@@ -1515,12 +1475,7 @@
             <w:vAlign w:val="top"/>
           </w:tcPr>
           <w:p>
-            <w:r/>
             <w:r>
-              <w:rPr>
-                <w:b w:val="0"/>
-                <w:sz w:val="14"/>
-              </w:rPr>
               <w:t>Day 8 - Fri Jun 19</w:t>
             </w:r>
           </w:p>
@@ -1531,13 +1486,8 @@
             <w:vAlign w:val="top"/>
           </w:tcPr>
           <w:p>
-            <w:r/>
             <w:r>
-              <w:rPr>
-                <w:b w:val="0"/>
-                <w:sz w:val="14"/>
-              </w:rPr>
-              <w:t>Timing calibration figure and table exported to Article Figures and Article Tables.</w:t>
+              <w:t>Timing calibration table/figure inputs acquired for pump, probe, lock-in reference, Pico trigger, and Myoglobin-CO timing route.</w:t>
             </w:r>
           </w:p>
         </w:tc>
@@ -1547,13 +1497,8 @@
             <w:vAlign w:val="top"/>
           </w:tcPr>
           <w:p>
-            <w:r/>
             <w:r>
-              <w:rPr>
-                <w:b w:val="0"/>
-                <w:sz w:val="14"/>
-              </w:rPr>
-              <w:t>Electrical timing calibration produces timing_offsets.yaml and raw timing data.</w:t>
+              <w:t>timing_offsets.yaml, raw Pico traces, Arduino MUX route logs, and uncertainty notes generated; direct Pico route used if a timing route remains blocked.</w:t>
             </w:r>
           </w:p>
         </w:tc>
@@ -1563,13 +1508,8 @@
             <w:vAlign w:val="top"/>
           </w:tcPr>
           <w:p>
-            <w:r/>
             <w:r>
-              <w:rPr>
-                <w:b w:val="0"/>
-                <w:sz w:val="14"/>
-              </w:rPr>
-              <w:t>Polarity, edge, sign, and offset verified.</w:t>
+              <w:t>Timing uncertainty is ready for manuscript values or an explicit limitation.</w:t>
             </w:r>
           </w:p>
         </w:tc>
@@ -1581,12 +1521,7 @@
             <w:vAlign w:val="top"/>
           </w:tcPr>
           <w:p>
-            <w:r/>
             <w:r>
-              <w:rPr>
-                <w:b w:val="0"/>
-                <w:sz w:val="14"/>
-              </w:rPr>
               <w:t>Day 9 - Sat Jun 20</w:t>
             </w:r>
           </w:p>
@@ -1597,13 +1532,8 @@
             <w:vAlign w:val="top"/>
           </w:tcPr>
           <w:p>
-            <w:r/>
             <w:r>
-              <w:rPr>
-                <w:b w:val="0"/>
-                <w:sz w:val="14"/>
-              </w:rPr>
-              <w:t>Detector noise/ratioing figure and table exported to Article Figures and Article Tables.</w:t>
+              <w:t>Detector noise/baseline and ratioing evidence acquired at/near Myoglobin-CO probe region.</w:t>
             </w:r>
           </w:p>
         </w:tc>
@@ -1613,13 +1543,8 @@
             <w:vAlign w:val="top"/>
           </w:tcPr>
           <w:p>
-            <w:r/>
             <w:r>
-              <w:rPr>
-                <w:b w:val="0"/>
-                <w:sz w:val="14"/>
-              </w:rPr>
-              <w:t>Dark and QCL baseline records acquired from real HF2LI/Pico routes.</w:t>
+              <w:t>Dark, QCL baseline, HF2LI/Pico synchronized records, and noise summary generated.</w:t>
             </w:r>
           </w:p>
         </w:tc>
@@ -1629,13 +1554,8 @@
             <w:vAlign w:val="top"/>
           </w:tcPr>
           <w:p>
-            <w:r/>
             <w:r>
-              <w:rPr>
-                <w:b w:val="0"/>
-                <w:sz w:val="14"/>
-              </w:rPr>
-              <w:t>Noise summary traceable to raw data.</w:t>
+              <w:t>Noise, drift, ratioing, and acquisition settings are locked for article scan.</w:t>
             </w:r>
           </w:p>
         </w:tc>
@@ -1647,12 +1567,7 @@
             <w:vAlign w:val="top"/>
           </w:tcPr>
           <w:p>
-            <w:r/>
             <w:r>
-              <w:rPr>
-                <w:b w:val="0"/>
-                <w:sz w:val="14"/>
-              </w:rPr>
               <w:t>Day 10 - Sun Jun 21</w:t>
             </w:r>
           </w:p>
@@ -1663,13 +1578,8 @@
             <w:vAlign w:val="top"/>
           </w:tcPr>
           <w:p>
-            <w:r/>
             <w:r>
-              <w:rPr>
-                <w:b w:val="0"/>
-                <w:sz w:val="14"/>
-              </w:rPr>
-              <w:t>Wavelength/trigger validation figure inputs exported to Article Figures and Article Tables.</w:t>
+              <w:t>Myoglobin-CO QCL/FTIR spectral-validation data and MIRcat wavelength/trigger validation exported to Article Figures/Tables.</w:t>
             </w:r>
           </w:p>
         </w:tc>
@@ -1679,13 +1589,8 @@
             <w:vAlign w:val="top"/>
           </w:tcPr>
           <w:p>
-            <w:r/>
             <w:r>
-              <w:rPr>
-                <w:b w:val="0"/>
-                <w:sz w:val="14"/>
-              </w:rPr>
-              <w:t>MIRcat wavelength and trigger validation completed on real hardware.</w:t>
+              <w:t>QCL CO-band scan, actual wavelength/readback log, HF2LI records, FTIR reference metadata or blocker captured.</w:t>
             </w:r>
           </w:p>
         </w:tc>
@@ -1695,13 +1600,8 @@
             <w:vAlign w:val="top"/>
           </w:tcPr>
           <w:p>
-            <w:r/>
             <w:r>
-              <w:rPr>
-                <w:b w:val="0"/>
-                <w:sz w:val="14"/>
-              </w:rPr>
-              <w:t>No uncleared manual-tune state.</w:t>
+              <w:t>Figure 7/table values are populated or a limitation is documented before pump-probe scan.</w:t>
             </w:r>
           </w:p>
         </w:tc>
@@ -1713,12 +1613,7 @@
             <w:vAlign w:val="top"/>
           </w:tcPr>
           <w:p>
-            <w:r/>
             <w:r>
-              <w:rPr>
-                <w:b w:val="0"/>
-                <w:sz w:val="14"/>
-              </w:rPr>
               <w:t>Day 11 - Mon Jun 22</w:t>
             </w:r>
           </w:p>
@@ -1729,13 +1624,8 @@
             <w:vAlign w:val="top"/>
           </w:tcPr>
           <w:p>
-            <w:r/>
             <w:r>
-              <w:rPr>
-                <w:b w:val="0"/>
-                <w:sz w:val="14"/>
-              </w:rPr>
-              <w:t>Representative scan placeholder in draft replaced with first real scan.</w:t>
+              <w:t>First complete UI-controlled Myoglobin-CO pump-probe proof-of-concept scan replaces representative-scan placeholder.</w:t>
             </w:r>
           </w:p>
         </w:tc>
@@ -1745,13 +1635,8 @@
             <w:vAlign w:val="top"/>
           </w:tcPr>
           <w:p>
-            <w:r/>
             <w:r>
-              <w:rPr>
-                <w:b w:val="0"/>
-                <w:sz w:val="14"/>
-              </w:rPr>
-              <w:t>Complete UI-controlled pump-probe run from SAFE_IDLE to SAFE_IDLE.</w:t>
+              <w:t>Run starts/ends in SAFE_IDLE, records pump/probe settings, timing recipe, detector data, Pico traces, and complete manifest.</w:t>
             </w:r>
           </w:p>
         </w:tc>
@@ -1761,13 +1646,8 @@
             <w:vAlign w:val="top"/>
           </w:tcPr>
           <w:p>
-            <w:r/>
             <w:r>
-              <w:rPr>
-                <w:b w:val="0"/>
-                <w:sz w:val="14"/>
-              </w:rPr>
-              <w:t>Complete manifest with no manual intervention after Start.</w:t>
+              <w:t>No manual intervention after Start except approved emergency stop.</w:t>
             </w:r>
           </w:p>
         </w:tc>
@@ -1779,12 +1659,7 @@
             <w:vAlign w:val="top"/>
           </w:tcPr>
           <w:p>
-            <w:r/>
             <w:r>
-              <w:rPr>
-                <w:b w:val="0"/>
-                <w:sz w:val="14"/>
-              </w:rPr>
               <w:t>Day 12 - Tue Jun 23</w:t>
             </w:r>
           </w:p>
@@ -1795,13 +1670,8 @@
             <w:vAlign w:val="top"/>
           </w:tcPr>
           <w:p>
-            <w:r/>
             <w:r>
-              <w:rPr>
-                <w:b w:val="0"/>
-                <w:sz w:val="14"/>
-              </w:rPr>
-              <w:t>Performance table locked under Article Tables.</w:t>
+              <w:t>Myoglobin-CO repeatability/control scans and final claim table completed.</w:t>
             </w:r>
           </w:p>
         </w:tc>
@@ -1811,13 +1681,8 @@
             <w:vAlign w:val="top"/>
           </w:tcPr>
           <w:p>
-            <w:r/>
             <w:r>
-              <w:rPr>
-                <w:b w:val="0"/>
-                <w:sz w:val="14"/>
-              </w:rPr>
-              <w:t>Repeatability and blocked-pump/control scans acquired.</w:t>
+              <w:t>Repeat scan, blocked-pump/control trace, performance_table.csv, dropped-point/error counts, and uncertainty rollup generated.</w:t>
             </w:r>
           </w:p>
         </w:tc>
@@ -1827,13 +1692,8 @@
             <w:vAlign w:val="top"/>
           </w:tcPr>
           <w:p>
-            <w:r/>
             <w:r>
-              <w:rPr>
-                <w:b w:val="0"/>
-                <w:sz w:val="14"/>
-              </w:rPr>
-              <w:t>All claims trace to raw data.</w:t>
+              <w:t>All final numeric claims trace to raw data; unsupported claims removed or deferred.</w:t>
             </w:r>
           </w:p>
         </w:tc>
@@ -1845,12 +1705,7 @@
             <w:vAlign w:val="top"/>
           </w:tcPr>
           <w:p>
-            <w:r/>
             <w:r>
-              <w:rPr>
-                <w:b w:val="0"/>
-                <w:sz w:val="14"/>
-              </w:rPr>
               <w:t>Day 13 - Wed Jun 24</w:t>
             </w:r>
           </w:p>
@@ -1861,13 +1716,8 @@
             <w:vAlign w:val="top"/>
           </w:tcPr>
           <w:p>
-            <w:r/>
             <w:r>
-              <w:rPr>
-                <w:b w:val="0"/>
-                <w:sz w:val="14"/>
-              </w:rPr>
-              <w:t>Full RSI draft and final figures and tables under Article root.</w:t>
+              <w:t>RSI_Draft_v3.1 advanced to coauthor-review draft with final figures, tables, source-data index, and unresolved-placeholders list cleared.</w:t>
             </w:r>
           </w:p>
         </w:tc>
@@ -1877,13 +1727,8 @@
             <w:vAlign w:val="top"/>
           </w:tcPr>
           <w:p>
-            <w:r/>
             <w:r>
-              <w:rPr>
-                <w:b w:val="0"/>
-                <w:sz w:val="14"/>
-              </w:rPr>
-              <w:t>No new features; only bug fixes required to reproduce manifests.</w:t>
+              <w:t>UI work limited to reproducibility bug fixes; archive bundle captures exact control state used for data.</w:t>
             </w:r>
           </w:p>
         </w:tc>
@@ -1893,13 +1738,8 @@
             <w:vAlign w:val="top"/>
           </w:tcPr>
           <w:p>
-            <w:r/>
             <w:r>
-              <w:rPr>
-                <w:b w:val="0"/>
-                <w:sz w:val="14"/>
-              </w:rPr>
-              <w:t>Every figure and table cited and sourced.</w:t>
+              <w:t>Every figure/table is cited and sourced; no [VALUE REQUIRED] remains unless explicitly moved to limitations or removed.</w:t>
             </w:r>
           </w:p>
         </w:tc>
@@ -1911,12 +1751,7 @@
             <w:vAlign w:val="top"/>
           </w:tcPr>
           <w:p>
-            <w:r/>
             <w:r>
-              <w:rPr>
-                <w:b w:val="0"/>
-                <w:sz w:val="14"/>
-              </w:rPr>
               <w:t>Day 14 - Thu Jun 25</w:t>
             </w:r>
           </w:p>
@@ -1927,13 +1762,8 @@
             <w:vAlign w:val="top"/>
           </w:tcPr>
           <w:p>
-            <w:r/>
             <w:r>
-              <w:rPr>
-                <w:b w:val="0"/>
-                <w:sz w:val="14"/>
-              </w:rPr>
-              <w:t>Coauthor-review package in Article root.</w:t>
+              <w:t>Peer-review-ready package completed for June 25.</w:t>
             </w:r>
           </w:p>
         </w:tc>
@@ -1943,13 +1773,8 @@
             <w:vAlign w:val="top"/>
           </w:tcPr>
           <w:p>
-            <w:r/>
             <w:r>
-              <w:rPr>
-                <w:b w:val="0"/>
-                <w:sz w:val="14"/>
-              </w:rPr>
-              <w:t>Code/data archive tag and manifest bundle only.</w:t>
+              <w:t>Manuscript/PDF proof, final figures/tables, supplement/cover-letter/checklists, data availability, and reviewer materials saved under Article root.</w:t>
             </w:r>
           </w:p>
         </w:tc>
@@ -1959,13 +1784,8 @@
             <w:vAlign w:val="top"/>
           </w:tcPr>
           <w:p>
-            <w:r/>
             <w:r>
-              <w:rPr>
-                <w:b w:val="0"/>
-                <w:sz w:val="14"/>
-              </w:rPr>
-              <w:t>Ready for June 26-30 edits/submission.</w:t>
+              <w:t>June 26-30 limited to coauthor edits, metadata, final proof, and submission.</w:t>
             </w:r>
           </w:p>
         </w:tc>
@@ -1981,7 +1801,7 @@
     </w:p>
     <w:p>
       <w:r>
-        <w:t>Each day has an Article/Thesis package deliverable and a UI/instrument-control deliverable. The two streams are stored in separate locations. If a required device or route cannot be verified, record a blocker; do not replace the item with fake data.</w:t>
+        <w:t>Each day has an Article/Thesis package deliverable and a UI/instrument-control deliverable. Day 6 onward is explicitly tied to closing RSI_Draft_v3.1 placeholders, acquiring the Myoglobin-CO validation/proof-of-concept data, and producing a June 25 peer-review package. If a required device, sample, route, or FTIR reference cannot be verified, record a blocker or limitation; do not replace the item with fake data.</w:t>
       </w:r>
     </w:p>
     <w:p>
@@ -2261,7 +2081,7 @@
         <w:pStyle w:val="ListBullet"/>
       </w:pPr>
       <w:r>
-        <w:t>Create recipes/pump_probe_single_point.yaml with required fields: wavelength_key, delay_ns, acquisition_duration_s or shot_count, T660-1 settings, T660-2 settings, MUX checkpoint routes, HF2LI preset, and Pico capture settings. Apply and read back on real T660 hardware in safe state.</w:t>
+        <w:t>Create recipes/pump_probe_single_point.yaml with required fields: wavelength_key, delay_ns, acquisition_duration_s or shot_count, T660-1 settings, T660-2 settings, MUX checkpoint routes for HF2LI DIO/AUX diagnostics, HF2LI preset, and PicoScope capture recipe/profile reference. Apply and read back on real T660 hardware in safe state.</w:t>
       </w:r>
     </w:p>
     <w:p>
@@ -2301,7 +2121,7 @@
         <w:pStyle w:val="Heading2"/>
       </w:pPr>
       <w:r>
-        <w:t>Day 4 - Mon Jun 15: Build the real MUX/Pico diagnostic path</w:t>
+        <w:t>Day 4 - Mon Jun 15: Build independent Arduino MUX and PicoScope diagnostic paths</w:t>
       </w:r>
     </w:p>
     <w:p>
@@ -2317,7 +2137,7 @@
         <w:pStyle w:val="ListBullet"/>
       </w:pPr>
       <w:r>
-        <w:t>Draft the Control Software section around configuration-driven operation, hardware-only checks, run manifests, MUX-based timing diagnostics, and raw-data traceability. Do not make UI convenience the scientific contribution.</w:t>
+        <w:t>Draft the Control Software section around configuration-driven operation, hardware-only checks, run manifests, Arduino MUX HF2LI DIO/AUX diagnostics, direct Pico timing diagnostics, and raw-data traceability. Do not make UI convenience the scientific contribution.</w:t>
       </w:r>
     </w:p>
     <w:p>
@@ -2325,7 +2145,7 @@
         <w:pStyle w:val="ListBullet"/>
       </w:pPr>
       <w:r>
-        <w:t>Add a Methods/Calibration paragraph explaining why the MUX routes T660, MIRcat, HF2LI, and detector-related signals to PicoScope channels for reproducible timing verification.</w:t>
+        <w:t>Add a Methods/Calibration paragraph explaining that the Arduino MUX and PicoScope are independent devices: the MUX routes only HF2LI DIO 9-15 and HF2LI AUX 1-4 diagnostic outputs to MUX Output A, Output B, and Output EXT, while the PicoScope is configured and captured through separate PicoScope recipes/checks. T660 TTL timing outputs remain direct point-to-point routes and are captured by direct Pico connections when timing evidence is required.</w:t>
       </w:r>
     </w:p>
     <w:p>
@@ -2365,7 +2185,7 @@
         <w:pStyle w:val="ListBullet"/>
       </w:pPr>
       <w:r>
-        <w:t>Implement PicoScope block capture for the configured real PicoScope: open unit, set resolution, set CH A/CH B ranges and coupling, set external trigger, allocate buffers, run block, wait until ready, retrieve samples, save raw trace, close. Route two documented T660 TTL outputs to CH A/CH B and the configured trigger to EXT; capture 100 pulses.</w:t>
+        <w:t>Implement PicoScope block capture for the configured real PicoScope using an editable PicoScope capture recipe/profile: open unit, set resolution, set CH A/CH B ranges and coupling, set external trigger or approved auto-trigger behavior, allocate buffers, run block, wait until ready, retrieve samples, save raw trace, close. Implement the Arduino MUX diagnostic separately: select documented HF2LI DIO/AUX diagnostic routes onto MUX Output A, Output B, and Output EXT, read back the route state, and write route evidence. Do not make either diagnostic depend on the other device. Do not route T660 TTL timing outputs through the MUX.</w:t>
       </w:r>
     </w:p>
     <w:p>
@@ -2389,7 +2209,7 @@
         <w:pStyle w:val="ListBullet"/>
       </w:pPr>
       <w:r>
-        <w:t>calibration/picoscope_ttl_capture.h5 or .csv contains 100 real pulses with acquisition settings.</w:t>
+        <w:t>calibration/arduino_mux_route_verification.csv contains real Arduino MUX route command/readback evidence. PicoScope trace files are produced only by independent PicoScope checks with acquisition recipe/profile hash and settings. If either path is blocked, record the exact device-specific blocker and any direct Pico timing fallback separately.</w:t>
       </w:r>
     </w:p>
     <w:p>
@@ -2503,7 +2323,7 @@
         <w:pStyle w:val="Heading2"/>
       </w:pPr>
       <w:r>
-        <w:t>Day 6 - Wed Jun 17: Implement HF2LI acquisition and detector evidence path</w:t>
+        <w:t>Day 6 - Wed Jun 17: Build the HF2LI/detector evidence path and freeze the Myoglobin-CO experiment plan</w:t>
       </w:r>
     </w:p>
     <w:p>
@@ -2519,7 +2339,7 @@
         <w:pStyle w:val="ListBullet"/>
       </w:pPr>
       <w:r>
-        <w:t>Draft the Detector and Lock-In Acquisition subsection: sample/reference detector paths, HF2LI CH1/CH2 assignment, demodulation, ratioing, time constants, sample rate, and settings capture.</w:t>
+        <w:t>Open RSI_Draft_v3.1 and create a Day 6 placeholder-to-evidence map for every remaining Myoglobin-CO, timing, detector, noise, wavelength, and proof-of-concept [VALUE REQUIRED] item.</w:t>
       </w:r>
     </w:p>
     <w:p>
@@ -2527,7 +2347,7 @@
         <w:pStyle w:val="ListBullet"/>
       </w:pPr>
       <w:r>
-        <w:t>Create C:\Users\Chris\Documents\UC Davis\SETI\Thesis\Article 1 - Review of Scientific Instruments\Tables\HF2LI_Detector_Variables.xlsx with columns: variable, LabOne node or preset field, value used, units, reason, and run-manifest field.</w:t>
+        <w:t>Create C:\Users\Chris\Documents\UC Davis\SETI\Thesis\Article 1 - Review of Scientific Instruments\Tables\HF2LI_Detector_Variables.xlsx and Myoglobin_CO_Experiment_Plan.xlsx with sample preparation, path length, buffer/CO handling notes, FTIR method, QCL scan range, step/dwell, lock-in settings, and acceptance criteria.</w:t>
       </w:r>
     </w:p>
     <w:p>
@@ -2535,7 +2355,7 @@
         <w:pStyle w:val="ListBullet"/>
       </w:pPr>
       <w:r>
-        <w:t>Add placeholders in the RSI draft for detector baseline, ratio noise, and repeatability values to be filled after Days 9 and 12.</w:t>
+        <w:t>Update Figure_Data_Dependencies.xlsx and Table_Data_Dependencies.xlsx so Figure 7, the proof-of-concept scan, timing, detector, and performance tables each have expected raw-data sources and article export paths.</w:t>
       </w:r>
     </w:p>
     <w:p>
@@ -2551,7 +2371,7 @@
         <w:pStyle w:val="ListBullet"/>
       </w:pPr>
       <w:r>
-        <w:t>Implement hf2li_service.py using the real LabOne connection: ziServer connection, device ID discovery, settings snapshot export, CH1/CH2 input configuration, demodulator preset loading, DIO/reference mapping from config, acquisition start/stop, and data save.</w:t>
+        <w:t>Implement/verify hf2li_service.py against the real LabOne connection: device ID discovery, CH1/CH2 input config, demodulator preset loading, settings snapshot export/reload, acquisition start/stop, and data save.</w:t>
       </w:r>
     </w:p>
     <w:p>
@@ -2559,7 +2379,7 @@
         <w:pStyle w:val="ListBullet"/>
       </w:pPr>
       <w:r>
-        <w:t>Create or update recipes/hf2li_presets.yaml with dark_baseline, qcl_reference_baseline, and pump_probe_acquisition presets.</w:t>
+        <w:t>Create/update recipes/hf2li_presets.yaml for dark_baseline, qcl_reference_baseline, myoglobin_co_spectrum, and myoglobin_co_pump_probe; capture a real 60 s HF2LI record with current detector/approved input.</w:t>
       </w:r>
     </w:p>
     <w:p>
@@ -2567,7 +2387,7 @@
         <w:pStyle w:val="ListBullet"/>
       </w:pPr>
       <w:r>
-        <w:t>Acquire a real 60 s HF2LI record with the current detector or approved input; save raw data, CSV summary, settings snapshot, and run manifest. Reload the stored settings snapshot and verify exact match.</w:t>
+        <w:t>Resolve the independent Day 4 Arduino MUX diagnostic and PicoScope settings/capture paths using current hardware_configuration.yaml plus editable PicoScope capture recipes/profiles; if either is blocked, log the exact device-specific blocker and define a direct Pico route for Day 8 timing evidence where timing evidence is required.</w:t>
       </w:r>
     </w:p>
     <w:p>
@@ -2583,7 +2403,7 @@
         <w:pStyle w:val="ListBullet"/>
       </w:pPr>
       <w:r>
-        <w:t>runs/YYYYMMDD_hf2li_60s_record/ contains raw data, CSV summary, settings snapshot, and manifest.</w:t>
+        <w:t>runs/YYYYMMDD_hf2li_60s_record/ contains raw HF2LI data, CSV summary, settings snapshot, settings-reload comparison, command log, and manifest.</w:t>
       </w:r>
     </w:p>
     <w:p>
@@ -2591,7 +2411,7 @@
         <w:pStyle w:val="ListBullet"/>
       </w:pPr>
       <w:r>
-        <w:t>Settings reload exactly, with differences explicitly listed if any.</w:t>
+        <w:t>Myoglobin-CO experiment plan and acceptance criteria exist under Article Tables only and list who/what must confirm sample readiness.</w:t>
       </w:r>
     </w:p>
     <w:p>
@@ -2599,7 +2419,7 @@
         <w:pStyle w:val="ListBullet"/>
       </w:pPr>
       <w:r>
-        <w:t>Detector/HF2LI variables table exists under Article Tables only.</w:t>
+        <w:t>Arduino MUX status and PicoScope status are each either passed or blocked, with direct-route timing fallback documented before timing calibration.</w:t>
       </w:r>
     </w:p>
     <w:p>
@@ -2607,7 +2427,7 @@
         <w:pStyle w:val="Heading2"/>
       </w:pPr>
       <w:r>
-        <w:t>Day 7 - Thu Jun 18: Freeze the add-only UI workflow interface</w:t>
+        <w:t>Day 7 - Thu Jun 18: Freeze the add-only workflow interface and Myoglobin-CO acquisition recipe</w:t>
       </w:r>
     </w:p>
     <w:p>
@@ -2623,7 +2443,7 @@
         <w:pStyle w:val="ListBullet"/>
       </w:pPr>
       <w:r>
-        <w:t>Convert the Control Software section from implementation notes into an instrument-reproducibility method: configuration hash, command path, workflow state machine, device readbacks, run manifests, and abort logging.</w:t>
+        <w:t>Revise the Control Software and workflow text into an instrument-reproducibility method: configuration hash, command path, workflow state machine, device readbacks, run manifests, abort logging, and MIRcat single-client constraint.</w:t>
       </w:r>
     </w:p>
     <w:p>
@@ -2631,7 +2451,7 @@
         <w:pStyle w:val="ListBullet"/>
       </w:pPr>
       <w:r>
-        <w:t>Export a command-flow diagram or UI/state-machine screenshot to C:\Users\Chris\Documents\UC Davis\SETI\Thesis\Article 1 - Review of Scientific Instruments\Figures. This file is an article figure candidate only and is not stored in the UI project.</w:t>
+        <w:t>Create C:\Users\Chris\Documents\UC Davis\SETI\Thesis\Article 1 - Review of Scientific Instruments\Tables\Source_Data_Index.xlsx and Final_Claim_Table.xlsx skeletons covering timing, wavelength, detector, Myoglobin-CO spectral validation, pump-probe proof-of-concept, controls, and UI/reproducibility claims.</w:t>
       </w:r>
     </w:p>
     <w:p>
@@ -2639,7 +2459,7 @@
         <w:pStyle w:val="ListBullet"/>
       </w:pPr>
       <w:r>
-        <w:t>Update C:\Users\Chris\Documents\UC Davis\SETI\Thesis\Article 1 - Review of Scientific Instruments\Tables\Figure_Data_Dependencies.xlsx so each planned figure and table points to raw UI data in calibration/ or runs/ and to its exported Article path.</w:t>
+        <w:t>Freeze the Myoglobin-CO acquisition recipe in article notes: scan range around the CO band, pump wavelength/fluence plan, delay-list strategy, controls, file naming, and go/no-go criteria.</w:t>
       </w:r>
     </w:p>
     <w:p>
@@ -2655,7 +2475,7 @@
         <w:pStyle w:val="ListBullet"/>
       </w:pPr>
       <w:r>
-        <w:t>Implement the only allowed action path: UI button -&gt; WorkflowCommand -&gt; StateMachine -&gt; DeviceAdapter/Service. Define states OFFLINE, SAFE_IDLE, CONFIGURED, ARMED, ACQUIRING, STOPPING, ERROR, and SHUTDOWN.</w:t>
+        <w:t xml:space="preserve">Ensure the UI action path remains UI button -&gt; WorkflowCommand -&gt; StateMachine -&gt; DeviceAdapter/Service for MIRcat, T660, PicoScope, Arduino MUX, and HF2LI; no widget talks directly to hardware.</w:t>
       </w:r>
     </w:p>
     <w:p>
@@ -2663,7 +2483,7 @@
         <w:pStyle w:val="ListBullet"/>
       </w:pPr>
       <w:r>
-        <w:t>Implement real-hardware workflows: startup_check, safe_shutdown, route_scope_signal, program_timing_recipe, arm_measurement, acquire_point, acquire_scan, and abort_to_safe.</w:t>
+        <w:t>Implement or verify startup_check, safe_shutdown, route_scope_signal, program_timing_recipe, arm_measurement, acquire_point, acquire_scan, and abort_to_safe; expose MIRcat wavenumber and timeout controls inside the widget.</w:t>
       </w:r>
     </w:p>
     <w:p>
@@ -2671,7 +2491,7 @@
         <w:pStyle w:val="ListBullet"/>
       </w:pPr>
       <w:r>
-        <w:t>Add one persistent log panel and one top-level emergency action that stops acquisition, turns MIRcat emission off, disarms as appropriate, forces T660 EOD, and records stop reason. Exercise startup/shutdown/route/recipe/acquire workflows on available real hardware only.</w:t>
+        <w:t>Exercise startup/shutdown/route/recipe/acquire dry-run or safe real-hardware workflow with the Myoglobin-CO recipe loaded, storing manifest and command log.</w:t>
       </w:r>
     </w:p>
     <w:p>
@@ -2695,7 +2515,7 @@
         <w:pStyle w:val="ListBullet"/>
       </w:pPr>
       <w:r>
-        <w:t>Real-hardware workflow logs exist for startup, shutdown, route, recipe, and acquire or blocked acquire.</w:t>
+        <w:t>Workflow logs exist for startup, shutdown, route, timing recipe, MIRcat parameter change, and HF2LI acquisition or blocked acquisition.</w:t>
       </w:r>
     </w:p>
     <w:p>
@@ -2703,7 +2523,7 @@
         <w:pStyle w:val="ListBullet"/>
       </w:pPr>
       <w:r>
-        <w:t>After this day, UI work is add-only except for bug fixes required to preserve the frozen command path.</w:t>
+        <w:t>After this day, UI architecture is frozen; changes are limited to add-only widgets/commands or bug fixes needed to reproduce Day 8-12 data.</w:t>
       </w:r>
     </w:p>
     <w:p>
@@ -2711,7 +2531,7 @@
         <w:pStyle w:val="Heading2"/>
       </w:pPr>
       <w:r>
-        <w:t>Day 8 - Fri Jun 19: Perform electrical timing calibration</w:t>
+        <w:t>Day 8 - Fri Jun 19: Complete electrical timing calibration for the Myoglobin-CO route</w:t>
       </w:r>
     </w:p>
     <w:p>
@@ -2727,7 +2547,7 @@
         <w:pStyle w:val="ListBullet"/>
       </w:pPr>
       <w:r>
-        <w:t>Create the Day 8 figure and table export plan in Article Tables before acquiring data: signal pair, programmed separations, expected output files, figure panel, table row, and acceptance threshold.</w:t>
+        <w:t>Create the Day 8 timing export plan in Article Tables for pump trigger, QCL/probe trigger, HF2LI reference, Pico EXT, and any MUX/direct routes used by the Myoglobin-CO experiment.</w:t>
       </w:r>
     </w:p>
     <w:p>
@@ -2735,7 +2555,7 @@
         <w:pStyle w:val="ListBullet"/>
       </w:pPr>
       <w:r>
-        <w:t>After analysis, export timing residual and jitter plots to C:\Users\Chris\Documents\UC Davis\SETI\Thesis\Article 1 - Review of Scientific Instruments\Figures and timing calibration table to C:\Users\Chris\Documents\UC Davis\SETI\Thesis\Article 1 - Review of Scientific Instruments\Tables.</w:t>
+        <w:t>After acquisition, export timing residual/jitter plots to C:\Users\Chris\Documents\UC Davis\SETI\Thesis\Article 1 - Review of Scientific Instruments\Figures and timing calibration tables to Article Tables; document route identity, cable/channel assignments, polarity, edge definitions, time-zero convention, and uncertainty budget.</w:t>
       </w:r>
     </w:p>
     <w:p>
@@ -2743,7 +2563,7 @@
         <w:pStyle w:val="ListBullet"/>
       </w:pPr>
       <w:r>
-        <w:t>Update the Timing and Synchronization section with measured offsets, jitter, trigger polarity, route identity, and sign convention only after raw files and manifests exist.</w:t>
+        <w:t>Update RSI_Draft_v3.1 Timing and Synchronization placeholders only with measured or explicitly bounded values traceable to raw files.</w:t>
       </w:r>
     </w:p>
     <w:p>
@@ -2759,7 +2579,7 @@
         <w:pStyle w:val="ListBullet"/>
       </w:pPr>
       <w:r>
-        <w:t>Program the timing_calibration recipe. For each critical pair documented in hardware_configuration.yaml, route two signals at a time through the MUX to Pico CH A/B and trigger from the configured digital reference.</w:t>
+        <w:t>Program the timing_calibration recipe and capture each critical pair listed in hardware_configuration.yaml; if the Arduino MUX remains blocked, keep that blocker separate and use the documented direct Pico route for timing evidence, retaining the blocker in the manifest.</w:t>
       </w:r>
     </w:p>
     <w:p>
@@ -2767,7 +2587,7 @@
         <w:pStyle w:val="ListBullet"/>
       </w:pPr>
       <w:r>
-        <w:t>For programmed separations of 0 ns, 100 ns, 1 us, 10 us, 100 us, and 1 ms, capture 100 shots each. Fit measured delay = programmed delay + channel offset.</w:t>
+        <w:t>For programmed separations of 0 ns, 100 ns, 1 us, 10 us, 100 us, and 1 ms, capture 100 shots each or record the approved reduced set with rationale.</w:t>
       </w:r>
     </w:p>
     <w:p>
@@ -2791,7 +2611,7 @@
         <w:pStyle w:val="ListBullet"/>
       </w:pPr>
       <w:r>
-        <w:t>Every polarity, trigger edge, and sign convention is verified.</w:t>
+        <w:t>Every polarity, trigger edge, sign convention, and route identity needed for Myoglobin-CO scans is verified.</w:t>
       </w:r>
     </w:p>
     <w:p>
@@ -2799,7 +2619,7 @@
         <w:pStyle w:val="ListBullet"/>
       </w:pPr>
       <w:r>
-        <w:t>Any failed pair is marked failed in timing_offsets.yaml or a blocker log and excluded from automated scans until fixed.</w:t>
+        <w:t>Any failed pair is marked failed or excluded from automated scans until fixed; uncertainty from missing routes is documented.</w:t>
       </w:r>
     </w:p>
     <w:p>
@@ -2807,7 +2627,7 @@
         <w:pStyle w:val="ListBullet"/>
       </w:pPr>
       <w:r>
-        <w:t>Article figure and table exports exist only under Article Figures and Article Tables and are traceable to raw calibration files.</w:t>
+        <w:t>Article figure/table exports exist only under Article Figures and Article Tables and are traceable to raw calibration files.</w:t>
       </w:r>
     </w:p>
     <w:p>
@@ -2815,7 +2635,7 @@
         <w:pStyle w:val="Heading2"/>
       </w:pPr>
       <w:r>
-        <w:t>Day 9 - Sat Jun 20: Acquire detector baseline and ratioing evidence</w:t>
+        <w:t>Day 9 - Sat Jun 20: Acquire detector baseline, ratioing, and noise evidence at the Myoglobin-CO probe region</w:t>
       </w:r>
     </w:p>
     <w:p>
@@ -2831,7 +2651,7 @@
         <w:pStyle w:val="ListBullet"/>
       </w:pPr>
       <w:r>
-        <w:t>Before acquisition, define exact outputs for detector evidence in Article Tables: CH1 RMS, CH2 RMS, ratio RMS, drift slope, Allan-deviation inclusion decision, and ratioing improvement metric.</w:t>
+        <w:t>Define detector evidence outputs in Article Tables: CH1/CH2 RMS, sample/reference ratio RMS, drift slope, Allan-deviation inclusion decision, ratioing improvement, noise-equivalent absorbance method, and Myoglobin-CO scan settings lock.</w:t>
       </w:r>
     </w:p>
     <w:p>
@@ -2839,7 +2659,7 @@
         <w:pStyle w:val="ListBullet"/>
       </w:pPr>
       <w:r>
-        <w:t>After analysis, export detector baseline/ratioing plots to C:\Users\Chris\Documents\UC Davis\SETI\Thesis\Article 1 - Review of Scientific Instruments\Figures and a noise summary table to C:\Users\Chris\Documents\UC Davis\SETI\Thesis\Article 1 - Review of Scientific Instruments\Tables.</w:t>
+        <w:t>After acquisition, export detector baseline/ratioing plots and noise summary table; add entries to Source_Data_Index.xlsx and Final_Claim_Table.xlsx.</w:t>
       </w:r>
     </w:p>
     <w:p>
@@ -2847,7 +2667,7 @@
         <w:pStyle w:val="ListBullet"/>
       </w:pPr>
       <w:r>
-        <w:t>Fill the Detector and Lock-In Acquisition subsection with measured values only after raw HF2LI/Pico files and manifests exist.</w:t>
+        <w:t>Fill detector/lock-in and noise/stability manuscript placeholders only after raw HF2LI/Pico files and manifests exist.</w:t>
       </w:r>
     </w:p>
     <w:p>
@@ -2863,7 +2683,7 @@
         <w:pStyle w:val="ListBullet"/>
       </w:pPr>
       <w:r>
-        <w:t>Acquire dark baseline with QCL emission off and pump blocked: 5 records x 10 s from HF2LI CH1/CH2 plus one Pico trace of the relevant digital trigger.</w:t>
+        <w:t>Acquire dark baseline with QCL emission off and pump blocked: 5 records x 10 s from HF2LI CH1/CH2 plus a Pico trace of the relevant digital trigger.</w:t>
       </w:r>
     </w:p>
     <w:p>
@@ -2871,7 +2691,7 @@
         <w:pStyle w:val="ListBullet"/>
       </w:pPr>
       <w:r>
-        <w:t>Acquire QCL baseline with pump blocked at lambda_mid and at lambda_mid +/- delta_lambda if permitted: 5 records x 10 s each. Record actual wavelength and emission state for every record.</w:t>
+        <w:t>Acquire QCL baseline with pump blocked at the selected Myoglobin-CO probe region and adjacent points if permitted; record MIRcat setpoint, actual wavelength, armed/emission state, lock-in settings, and sample/reference signals.</w:t>
       </w:r>
     </w:p>
     <w:p>
@@ -2879,7 +2699,7 @@
         <w:pStyle w:val="ListBullet"/>
       </w:pPr>
       <w:r>
-        <w:t>Compute CH1 RMS, CH2 RMS, CH1/CH2 ratio RMS, drift slope, and ratioing improvement. Route HF2LI analog outputs through MUX to Pico CH A/B and capture 20 synchronized traces with a digital EXT trigger.</w:t>
+        <w:t>Compute CH1 RMS, CH2 RMS, ratio RMS, drift slope, ratioing improvement, and initial noise-equivalent absorbance; capture synchronized HF2LI analog/Pico traces where route allows.</w:t>
       </w:r>
     </w:p>
     <w:p>
@@ -2895,7 +2715,7 @@
         <w:pStyle w:val="ListBullet"/>
       </w:pPr>
       <w:r>
-        <w:t>calibration/detector_baseline.csv, ratio_noise_summary.md, raw HF2LI data, Pico traces, and manifests exist.</w:t>
+        <w:t>calibration/detector_baseline.csv, ratio_noise_summary.md, raw HF2LI data, Pico traces or route blocker, and manifests exist.</w:t>
       </w:r>
     </w:p>
     <w:p>
@@ -2903,7 +2723,7 @@
         <w:pStyle w:val="ListBullet"/>
       </w:pPr>
       <w:r>
-        <w:t>If coefficient of variation exceeds the predeclared threshold, adjust only HF2LI preset parameters and re-record; do not modify UI architecture.</w:t>
+        <w:t>If coefficient of variation exceeds the predeclared threshold, adjust only HF2LI preset/optical operating parameters and re-record; do not alter UI architecture.</w:t>
       </w:r>
     </w:p>
     <w:p>
@@ -2911,7 +2731,7 @@
         <w:pStyle w:val="ListBullet"/>
       </w:pPr>
       <w:r>
-        <w:t>Exported article figure and table files exist only in Article Figures and Article Tables.</w:t>
+        <w:t>Measurement settings for Day 10-12 are locked or explicitly limited.</w:t>
       </w:r>
     </w:p>
     <w:p>
@@ -2919,7 +2739,7 @@
         <w:pStyle w:val="Heading2"/>
       </w:pPr>
       <w:r>
-        <w:t>Day 10 - Sun Jun 21: Validate MIRcat wavelength and trigger behavior</w:t>
+        <w:t>Day 10 - Sun Jun 21: Acquire Myoglobin-CO QCL/FTIR spectral validation and MIRcat wavelength evidence</w:t>
       </w:r>
     </w:p>
     <w:p>
@@ -2935,7 +2755,7 @@
         <w:pStyle w:val="ListBullet"/>
       </w:pPr>
       <w:r>
-        <w:t>Draft the wavelength-control validation paragraph: selected wavelengths, actual wavelength polling, time-to-tune, trigger-line timing, and how wavelength state is recorded in the manifest.</w:t>
+        <w:t>Acquire or import confirmed FTIR reference for Myoglobin-CO with instrument model, transmission/ATR geometry, resolution, apodization, scans, background, sample preparation, and post-processing recorded.</w:t>
       </w:r>
     </w:p>
     <w:p>
@@ -2943,7 +2763,7 @@
         <w:pStyle w:val="ListBullet"/>
       </w:pPr>
       <w:r>
-        <w:t>Export wavelength/trigger validation plots and table entries to C:\Users\Chris\Documents\UC Davis\SETI\Thesis\Article 1 - Review of Scientific Instruments\Figures and C:\Users\Chris\Documents\UC Davis\SETI\Thesis\Article 1 - Review of Scientific Instruments\Tables.</w:t>
+        <w:t>Acquire QCL spectrum over the Myoglobin-CO CO-band region; export Figure 7 QCL/FTIR comparison and table rows for CO-band position agreement, FWHM/line shape, SNR, and stability/repeatability.</w:t>
       </w:r>
     </w:p>
     <w:p>
@@ -2951,7 +2771,7 @@
         <w:pStyle w:val="ListBullet"/>
       </w:pPr>
       <w:r>
-        <w:t>Update the figure/data dependency records with exact raw files and run manifests.</w:t>
+        <w:t>Also complete the MIRcat wavelength/trigger validation paragraph and dependencies: setpoint/readback, time-to-tune, trigger-line timing, scan status, and manifest IDs.</w:t>
       </w:r>
     </w:p>
     <w:p>
@@ -2967,7 +2787,7 @@
         <w:pStyle w:val="ListBullet"/>
       </w:pPr>
       <w:r>
-        <w:t>Run MIRcat manual tune at lambda_low, lambda_mid, and lambda_high within the approved operating band. For each, wait until tuned, record actual wavelength, time-to-tune, TEC/armed/emission state, HF2LI CH1/CH2/ratio for 10 s, and Pico trigger trace.</w:t>
+        <w:t>Run MIRcat tune/scan steps over the approved Myoglobin-CO CO-band range, including lambda_mid 1858 cm^-1 when relevant and any selected band edges within 1638.8-2077.3 cm^-1.</w:t>
       </w:r>
     </w:p>
     <w:p>
@@ -2975,7 +2795,7 @@
         <w:pStyle w:val="ListBullet"/>
       </w:pPr>
       <w:r>
-        <w:t>Run one narrow step-measure or sweep validation if appropriate. Poll MIRcat scan status at an interval consistent with the SDK guidance and log each status response.</w:t>
+        <w:t>At each point, wait until tuned, record actual wavelength, time-to-tune, TEC/armed/emission state, HF2LI CH1/CH2/ratio, Pico trigger trace where available, and sample condition.</w:t>
       </w:r>
     </w:p>
     <w:p>
@@ -2983,7 +2803,7 @@
         <w:pStyle w:val="ListBullet"/>
       </w:pPr>
       <w:r>
-        <w:t>Verify MIRcat scan direction, tuned/scan firing, wavelength trigger, process trigger, and laser output on/off lines arrive at the HF2LI/Pico routes defined in hardware_configuration.yaml.</w:t>
+        <w:t>Verify scan direction, tuned/scan firing, wavelength trigger, process trigger, and laser output on/off lines on configured HF2LI/Pico routes or record the explicit blocker.</w:t>
       </w:r>
     </w:p>
     <w:p>
@@ -2999,7 +2819,7 @@
         <w:pStyle w:val="ListBullet"/>
       </w:pPr>
       <w:r>
-        <w:t>calibration/mircat_scan_validation.csv contains setpoint, actual wavelength, DIO timing, lock-in response, scan status, and manifest ID.</w:t>
+        <w:t>calibration/mircat_scan_validation.csv and runs/YYYYMMDD_myoglobin_co_qcl_spectrum/ contain setpoint, actual wavelength, DIO timing, lock-in response, FTIR source, scan status, and manifest IDs.</w:t>
       </w:r>
     </w:p>
     <w:p>
@@ -3007,7 +2827,7 @@
         <w:pStyle w:val="ListBullet"/>
       </w:pPr>
       <w:r>
-        <w:t>No manual-tune state remains uncleared.</w:t>
+        <w:t>Figure 7 and Myoglobin-CO table values are populated; if sample/FTIR/QCL data are unusable, a limitation and fallback figure decision are recorded before Day 11.</w:t>
       </w:r>
     </w:p>
     <w:p>
@@ -3015,7 +2835,7 @@
         <w:pStyle w:val="ListBullet"/>
       </w:pPr>
       <w:r>
-        <w:t>Article exports are traceable to raw validation data.</w:t>
+        <w:t>No MIRcat manual-tune state remains uncleared and emission is left off unless an approved scan requires otherwise.</w:t>
       </w:r>
     </w:p>
     <w:p>
@@ -3023,7 +2843,7 @@
         <w:pStyle w:val="Heading2"/>
       </w:pPr>
       <w:r>
-        <w:t>Day 11 - Mon Jun 22: Run the first complete article-relevant pump-probe scan</w:t>
+        <w:t>Day 11 - Mon Jun 22: Run the first complete Myoglobin-CO pump-probe proof-of-concept scan</w:t>
       </w:r>
     </w:p>
     <w:p>
@@ -3039,7 +2859,7 @@
         <w:pStyle w:val="ListBullet"/>
       </w:pPr>
       <w:r>
-        <w:t>Define the representative scan caption and table entry before acquisition: wavelength, delay list, acquisition time/shot count, timing recipe, detector channels, and blocked/control status.</w:t>
+        <w:t>Define the representative Myoglobin-CO pump-probe caption/table row before acquisition: sample state, pump wavelength/fluence, probe wavenumber, delay list, acquisition time/shot count, timing recipe, detector channels, and control status.</w:t>
       </w:r>
     </w:p>
     <w:p>
@@ -3047,7 +2867,7 @@
         <w:pStyle w:val="ListBullet"/>
       </w:pPr>
       <w:r>
-        <w:t>After acquisition, export the representative scan plot to C:\Users\Chris\Documents\UC Davis\SETI\Thesis\Article 1 - Review of Scientific Instruments\Figures and add a source-data row to C:\Users\Chris\Documents\UC Davis\SETI\Thesis\Article 1 - Review of Scientific Instruments\Tables\Source_Data_Index.xlsx.</w:t>
+        <w:t>After acquisition, export the representative pump-probe plot and source-data row; replace Full-System Proof-of-Concept placeholders with measured acquisition notes.</w:t>
       </w:r>
     </w:p>
     <w:p>
@@ -3055,7 +2875,7 @@
         <w:pStyle w:val="ListBullet"/>
       </w:pPr>
       <w:r>
-        <w:t>Replace the representative-scan placeholder in the RSI draft with the real figure and measured acquisition notes.</w:t>
+        <w:t>Record any deviations from the planned experiment as limitations rather than unstated method changes.</w:t>
       </w:r>
     </w:p>
     <w:p>
@@ -3071,7 +2891,7 @@
         <w:pStyle w:val="ListBullet"/>
       </w:pPr>
       <w:r>
-        <w:t>With approved laser-safety setup, shutters/attenuation, and detector protection, run one UI-controlled acquisition at lambda_mid or the selected article wavelength.</w:t>
+        <w:t>With approved laser-safety setup, shutters/attenuation, detector protection, and prepared Myoglobin-CO sample, run one UI-controlled pump-probe acquisition at the selected CO-band probe wavenumber.</w:t>
       </w:r>
     </w:p>
     <w:p>
@@ -3079,7 +2899,7 @@
         <w:pStyle w:val="ListBullet"/>
       </w:pPr>
       <w:r>
-        <w:t>Use a fixed delay list around temporal overlap, adjusted only for the actual expected overlap window: pre-zero, near-zero, early positive delay, intermediate delay, and late delay points. Record exact list in the run manifest.</w:t>
+        <w:t>Use a fixed delay list around temporal overlap: pre-zero, near-zero, early positive delay, intermediate delay, and late delay points; store the exact list in the manifest.</w:t>
       </w:r>
     </w:p>
     <w:p>
@@ -3087,7 +2907,7 @@
         <w:pStyle w:val="ListBullet"/>
       </w:pPr>
       <w:r>
-        <w:t>At each delay, acquire the predetermined shot count or time window; store HF2LI ratio and save Pico traces for the first, middle, and last delay. The scan must start from SAFE_IDLE, program T660 recipes, arm devices, acquire every point, and return to SAFE_IDLE.</w:t>
+        <w:t>At each delay, acquire the predetermined shot count/time window, store HF2LI sample/reference/ratio, and save Pico traces for first/middle/last delay; workflow must start and end in SAFE_IDLE.</w:t>
       </w:r>
     </w:p>
     <w:p>
@@ -3103,7 +2923,7 @@
         <w:pStyle w:val="ListBullet"/>
       </w:pPr>
       <w:r>
-        <w:t>One complete scan writes raw data, summary, command logs, device readbacks, and a complete run manifest.</w:t>
+        <w:t>runs/YYYYMMDD_myoglobin_co_pump_probe_scan/ contains raw data, summary, command logs, device readbacks, sample notes, timing offsets, and complete manifest.</w:t>
       </w:r>
     </w:p>
     <w:p>
@@ -3111,7 +2931,7 @@
         <w:pStyle w:val="ListBullet"/>
       </w:pPr>
       <w:r>
-        <w:t>No manual intervention occurs after pressing Start except approved emergency stop.</w:t>
+        <w:t>No manual intervention occurs after pressing Start except approved emergency stop; any intervention invalidates the scan for the representative figure unless documented as a limitation.</w:t>
       </w:r>
     </w:p>
     <w:p>
@@ -3119,7 +2939,7 @@
         <w:pStyle w:val="ListBullet"/>
       </w:pPr>
       <w:r>
-        <w:t>Article representative figure export is created under Article Figures only.</w:t>
+        <w:t>Representative figure export is created under Article Figures only and links back to raw files.</w:t>
       </w:r>
     </w:p>
     <w:p>
@@ -3127,7 +2947,7 @@
         <w:pStyle w:val="Heading2"/>
       </w:pPr>
       <w:r>
-        <w:t>Day 12 - Tue Jun 23: Acquire repeatability/control data and lock claims</w:t>
+        <w:t>Day 12 - Tue Jun 23: Acquire Myoglobin-CO repeatability/control data and lock all claims</w:t>
       </w:r>
     </w:p>
     <w:p>
@@ -3143,7 +2963,7 @@
         <w:pStyle w:val="ListBullet"/>
       </w:pPr>
       <w:r>
-        <w:t>Create or update the final claim table in Article Tables with rows for timing uncertainty, wavelength range tested, detector noise/ratioing performance, acquisition throughput, repeatability, blocked-pump false response, dropped-point count, and UI/driver error count.</w:t>
+        <w:t>Create/update Final_Claim_Table.xlsx with timing uncertainty, wavelength range tested, detector noise/ratioing performance, spectral validation metrics, acquisition throughput, repeatability, blocked-pump/control response, dropped-point count, and UI/driver error count.</w:t>
       </w:r>
     </w:p>
     <w:p>
@@ -3151,7 +2971,7 @@
         <w:pStyle w:val="ListBullet"/>
       </w:pPr>
       <w:r>
-        <w:t>Update the abstract, Performance Demonstration, Limitations, and Conclusion with only locked numbers that appear in the claim table and trace to raw data.</w:t>
+        <w:t>Update the Abstract, Performance Demonstration, Limitations, Conclusion, and Data Availability using only locked numbers from the claim table and Source_Data_Index.xlsx.</w:t>
       </w:r>
     </w:p>
     <w:p>
@@ -3159,7 +2979,7 @@
         <w:pStyle w:val="ListBullet"/>
       </w:pPr>
       <w:r>
-        <w:t>Mark any attractive but unsupported statement as removed or deferred; do not leave it as a placeholder.</w:t>
+        <w:t>Remove or defer unsupported claims; do not leave [VALUE REQUIRED] in active claims.</w:t>
       </w:r>
     </w:p>
     <w:p>
@@ -3175,7 +2995,7 @@
         <w:pStyle w:val="ListBullet"/>
       </w:pPr>
       <w:r>
-        <w:t>Repeat the Day 11 scan without changing alignment. Then run a blocked-pump control over the same delay list or a reduced list containing pre-zero, near-zero, and late-time points.</w:t>
+        <w:t>Repeat the Day 11 Myoglobin-CO scan without changing alignment, then run a blocked-pump/control scan over the same delay list or a reduced list containing pre-zero, near-zero, and late-time points.</w:t>
       </w:r>
     </w:p>
     <w:p>
@@ -3183,7 +3003,7 @@
         <w:pStyle w:val="ListBullet"/>
       </w:pPr>
       <w:r>
-        <w:t>Compute mean response, standard error, scan-to-scan repeatability, blocked-pump false response, timing uncertainty from Day 8, acquisition throughput, dropped-point count, and UI/driver error count.</w:t>
+        <w:t>Compute mean response, standard error, scan-to-scan repeatability, blocked-pump false response, timing uncertainty rollup, acquisition throughput, dropped-point count, and UI/driver error count.</w:t>
       </w:r>
     </w:p>
     <w:p>
@@ -3191,7 +3011,7 @@
         <w:pStyle w:val="ListBullet"/>
       </w:pPr>
       <w:r>
-        <w:t>Save performance_table.csv in the UI run/calibration output area as a machine-readable measurement summary; export the article-facing table to Article Tables only.</w:t>
+        <w:t>Save performance_table.csv plus raw/control data and manifests in UI outputs; export article-facing final claim and performance tables to Article Tables only.</w:t>
       </w:r>
     </w:p>
     <w:p>
@@ -3207,7 +3027,7 @@
         <w:pStyle w:val="ListBullet"/>
       </w:pPr>
       <w:r>
-        <w:t>Every final numeric claim in the draft appears in the Article claim table and links to a raw file plus run manifest.</w:t>
+        <w:t>Every final numeric claim in the draft appears in Final_Claim_Table.xlsx and links to a raw file plus manifest.</w:t>
       </w:r>
     </w:p>
     <w:p>
@@ -3215,7 +3035,7 @@
         <w:pStyle w:val="ListBullet"/>
       </w:pPr>
       <w:r>
-        <w:t>No new performance claim may be added after this day unless its raw data already exist.</w:t>
+        <w:t>Myoglobin-CO repeatability/control outcome is included or explicitly listed as a limitation.</w:t>
       </w:r>
     </w:p>
     <w:p>
@@ -3223,7 +3043,7 @@
         <w:pStyle w:val="ListBullet"/>
       </w:pPr>
       <w:r>
-        <w:t>Blocked-pump/control result is included or explicitly listed as a limitation.</w:t>
+        <w:t>No new performance claim may be added after this day unless raw data already exist.</w:t>
       </w:r>
     </w:p>
     <w:p>
@@ -3231,7 +3051,7 @@
         <w:pStyle w:val="Heading2"/>
       </w:pPr>
       <w:r>
-        <w:t>Day 13 - Wed Jun 24: Assemble full RSI draft and final article figures</w:t>
+        <w:t>Day 13 - Wed Jun 24: Assemble the peer-review-ready RSI draft, figures, tables, and source-data index</w:t>
       </w:r>
     </w:p>
     <w:p>
@@ -3247,7 +3067,7 @@
         <w:pStyle w:val="ListBullet"/>
       </w:pPr>
       <w:r>
-        <w:t>Generate final article figures from raw data into Article Figures only: system schematic, timing/control diagram, UI/command-flow figure if used, electrical timing residuals/jitter, detector/reference-ratio noise, wavelength/trigger validation if used, and representative pump-probe scan.</w:t>
+        <w:t>Generate final article figures from raw data: system schematic, timing/control diagram, electrical timing residuals/jitter, detector/reference-ratio noise, Myoglobin-CO QCL/FTIR comparison, representative pump-probe scan, and noise/performance figure if used.</w:t>
       </w:r>
     </w:p>
     <w:p>
@@ -3255,7 +3075,7 @@
         <w:pStyle w:val="ListBullet"/>
       </w:pPr>
       <w:r>
-        <w:t>Complete the RSI manuscript draft in the Article root: Title, Abstract, Introduction, Instrument Design, Timing and Synchronization, Control Software, Calibration, Performance Demonstration, Limitations, Conclusion, Author Declarations, Data Availability, and References.</w:t>
+        <w:t>Advance RSI_Draft_v3.1 to the next manuscript version in the Article root; complete Title, Abstract, Introduction, Instrument Design, Timing and Synchronization, Control Software, Calibration, Myoglobin-CO Proof-of-Concept, Performance, Limitations, Conclusion, Declarations, Data Availability, and References.</w:t>
       </w:r>
     </w:p>
     <w:p>
@@ -3263,7 +3083,7 @@
         <w:pStyle w:val="ListBullet"/>
       </w:pPr>
       <w:r>
-        <w:t>Create or update C:\Users\Chris\Documents\UC Davis\SETI\Thesis\Article 1 - Review of Scientific Instruments\Tables\Source_Data_Index.xlsx so every figure panel and table value maps to raw data, manifest, analysis/export method, and file hash if available.</w:t>
+        <w:t>Create/update Source_Data_Index.xlsx so every figure panel and table value maps to raw data, manifest, analysis/export method, and file hash if available.</w:t>
       </w:r>
     </w:p>
     <w:p>
@@ -3279,7 +3099,7 @@
         <w:pStyle w:val="ListBullet"/>
       </w:pPr>
       <w:r>
-        <w:t>Do not add new convenience features. Perform only bug fixes needed to reproduce the acquired runs, re-open manifests, or export settings/readbacks.</w:t>
+        <w:t>Do not add convenience features. Perform only bug fixes needed to reproduce acquired runs, reopen manifests, export settings/readbacks, or rerun failed article measurements.</w:t>
       </w:r>
     </w:p>
     <w:p>
@@ -3287,7 +3107,7 @@
         <w:pStyle w:val="ListBullet"/>
       </w:pPr>
       <w:r>
-        <w:t>Freeze the UI command path and record a code tag or commit hash in a manifest bundle.</w:t>
+        <w:t>Freeze the UI/control command path and record git commit/hash, hardware_configuration.yaml hash, timing_offsets.yaml, recipes, HF2LI presets, run manifests, and command logs in an archive bundle.</w:t>
       </w:r>
     </w:p>
     <w:p>
@@ -3295,7 +3115,7 @@
         <w:pStyle w:val="ListBullet"/>
       </w:pPr>
       <w:r>
-        <w:t>Export an archive bundle containing hardware_configuration.yaml hash, timing_offsets.yaml, recipes used, HF2LI presets, run manifests, and command logs. The archive contains no manuscript drafts, article figures, or article tables.</w:t>
+        <w:t>Verify the MIRcat widget still exposes user controls needed because the manufacturer UI cannot be open concurrently: setpoint, timeouts, tune/status/disarm/cancel manual tune, emission-safe state reporting.</w:t>
       </w:r>
     </w:p>
     <w:p>
@@ -3311,7 +3131,7 @@
         <w:pStyle w:val="ListBullet"/>
       </w:pPr>
       <w:r>
-        <w:t>Every figure and table is cited in the draft.</w:t>
+        <w:t>Every figure/table is cited in the manuscript and has a source-data row.</w:t>
       </w:r>
     </w:p>
     <w:p>
@@ -3319,7 +3139,7 @@
         <w:pStyle w:val="ListBullet"/>
       </w:pPr>
       <w:r>
-        <w:t>Every performance value has a source file and manifest ID.</w:t>
+        <w:t>No [VALUE REQUIRED] remains in active manuscript text; unresolved data are moved to limitations or removed.</w:t>
       </w:r>
     </w:p>
     <w:p>
@@ -3327,7 +3147,7 @@
         <w:pStyle w:val="ListBullet"/>
       </w:pPr>
       <w:r>
-        <w:t>UI archive bundle contains reproducibility artifacts only, not article/thesis files.</w:t>
+        <w:t>UI archive bundle contains reproducibility artifacts only, not manuscript/figure/table files.</w:t>
       </w:r>
     </w:p>
     <w:p>
@@ -3335,7 +3155,7 @@
         <w:pStyle w:val="Heading2"/>
       </w:pPr>
       <w:r>
-        <w:t>Day 14 - Thu Jun 25: Create submission-ready coauthor package</w:t>
+        <w:t>Day 14 - Thu Jun 25: Create the peer-review-ready coauthor package</w:t>
       </w:r>
     </w:p>
     <w:p>
@@ -3351,7 +3171,7 @@
         <w:pStyle w:val="ListBullet"/>
       </w:pPr>
       <w:r>
-        <w:t>Save the coauthor-review manuscript as a new version at the Article root, using the next available RSI_draft_v#.docx version number. Compile or export a PDF proof if needed, stored in the Article root.</w:t>
+        <w:t>Save the June 25 coauthor-review manuscript as the next RSI_Draft_v#.docx and export a PDF proof in the Article root.</w:t>
       </w:r>
     </w:p>
     <w:p>
@@ -3359,7 +3179,7 @@
         <w:pStyle w:val="ListBullet"/>
       </w:pPr>
       <w:r>
-        <w:t>Place supplementary material, cover letter draft, author checklist, reviewer list draft, and data-availability wording in C:\Users\Chris\Documents\UC Davis\SETI\Thesis\Article 1 - Review of Scientific Instruments; place final figures in C:\Users\Chris\Documents\UC Davis\SETI\Thesis\Article 1 - Review of Scientific Instruments\Figures; place source-data, performance, and component tables in C:\Users\Chris\Documents\UC Davis\SETI\Thesis\Article 1 - Review of Scientific Instruments\Tables.</w:t>
+        <w:t>Place final figures/tables, supplementary material, cover letter draft, author checklist, reviewer list draft, data availability wording, author declarations, funding/conflicts/author contributions, and reference file in Article root subfolders.</w:t>
       </w:r>
     </w:p>
     <w:p>
@@ -3367,7 +3187,7 @@
         <w:pStyle w:val="ListBullet"/>
       </w:pPr>
       <w:r>
-        <w:t>Run the article checklist: author order, affiliations, funding, conflicts, author contributions, acknowledgments, data availability, suggested reviewers, opposed reviewers, figure resolution, table titles, and reference completeness.</w:t>
+        <w:t>Run the peer-review readiness checklist: title/abstract claims match claim table, figure resolution/readability, table titles, references, author order/affiliations, acknowledgments, data availability, suggested/opposed reviewers, and supplement completeness.</w:t>
       </w:r>
     </w:p>
     <w:p>
@@ -3383,7 +3203,7 @@
         <w:pStyle w:val="ListBullet"/>
       </w:pPr>
       <w:r>
-        <w:t>Create a reproducibility tag or archive bundle for the exact UI/control state used for the article data: git commit, config hash, timing offsets, recipes, presets, run manifests, raw-data index, and error logs.</w:t>
+        <w:t>Create a reproducibility tag/archive bundle for the exact UI/control state used for article data: git commit, config hash, timing offsets, recipes, presets, run manifests, raw-data index, and error logs.</w:t>
       </w:r>
     </w:p>
     <w:p>
@@ -3391,7 +3211,7 @@
         <w:pStyle w:val="ListBullet"/>
       </w:pPr>
       <w:r>
-        <w:t>Verify emergency stop, safe shutdown, and read-only manifest review still work after any Day 13 bug fixes.</w:t>
+        <w:t>Verify emergency stop, safe shutdown, MIRcat emission-off/disarm path, and read-only manifest review still work after Day 13 bug fixes.</w:t>
       </w:r>
     </w:p>
     <w:p>
@@ -3399,7 +3219,7 @@
         <w:pStyle w:val="ListBullet"/>
       </w:pPr>
       <w:r>
-        <w:t>Do not create article PDF/DOCX/figure and table outputs from inside the UI project; all article packaging occurs in the Article 1 RSI folder.</w:t>
+        <w:t>Do not create manuscript DOCX/PDF/figure/table outputs from inside the UI project; article packaging occurs only in the Article 1 RSI folder.</w:t>
       </w:r>
     </w:p>
     <w:p>
@@ -3415,7 +3235,7 @@
         <w:pStyle w:val="ListBullet"/>
       </w:pPr>
       <w:r>
-        <w:t>Coauthor package is ready for review from the Article path.</w:t>
+        <w:t>Coauthor-review package is ready from the Article path on June 25.</w:t>
       </w:r>
     </w:p>
     <w:p>
@@ -3431,7 +3251,7 @@
         <w:pStyle w:val="ListBullet"/>
       </w:pPr>
       <w:r>
-        <w:t>Remaining June 26-30 work is limited to edits, metadata entry, author approvals, and final submission.</w:t>
+        <w:t>June 26-30 work is limited to coauthor edits, journal metadata, final proofing, author approvals, and submission.</w:t>
       </w:r>
     </w:p>
     <w:p>
@@ -3506,12 +3326,7 @@
             <w:vAlign w:val="top"/>
           </w:tcPr>
           <w:p>
-            <w:r/>
             <w:r>
-              <w:rPr>
-                <w:b w:val="0"/>
-                <w:sz w:val="16"/>
-              </w:rPr>
               <w:t>June 26-27</w:t>
             </w:r>
           </w:p>
@@ -3522,13 +3337,8 @@
             <w:vAlign w:val="top"/>
           </w:tcPr>
           <w:p>
-            <w:r/>
             <w:r>
-              <w:rPr>
-                <w:b w:val="0"/>
-                <w:sz w:val="16"/>
-              </w:rPr>
-              <w:t>Coauthor edits, reference cleanup, figure readability check, supplement cleanup. No new UI features and no new measurements unless an existing figure and table is technically wrong.</w:t>
+              <w:t>Coauthor edits, response to internal comments, reference cleanup, figure readability check, and supplement cleanup. No new UI features and no new measurements unless an existing figure or table is technically wrong.</w:t>
             </w:r>
           </w:p>
         </w:tc>
@@ -3540,12 +3350,7 @@
             <w:vAlign w:val="top"/>
           </w:tcPr>
           <w:p>
-            <w:r/>
             <w:r>
-              <w:rPr>
-                <w:b w:val="0"/>
-                <w:sz w:val="16"/>
-              </w:rPr>
               <w:t>June 28</w:t>
             </w:r>
           </w:p>
@@ -3556,13 +3361,8 @@
             <w:vAlign w:val="top"/>
           </w:tcPr>
           <w:p>
-            <w:r/>
             <w:r>
-              <w:rPr>
-                <w:b w:val="0"/>
-                <w:sz w:val="16"/>
-              </w:rPr>
-              <w:t>Final technical proof: every claim in the abstract/conclusion appears in the Article claim table or is directly supported by a cited component/specification. Verify all article files are under the Article 1 RSI path.</w:t>
+              <w:t>Final technical proof: every claim in the abstract/conclusion appears in Final_Claim_Table.xlsx or is directly supported by a cited component/specification. Verify all article files are under the Article 1 RSI path and Source_Data_Index.xlsx is complete.</w:t>
             </w:r>
           </w:p>
         </w:tc>
@@ -3574,12 +3374,7 @@
             <w:vAlign w:val="top"/>
           </w:tcPr>
           <w:p>
-            <w:r/>
             <w:r>
-              <w:rPr>
-                <w:b w:val="0"/>
-                <w:sz w:val="16"/>
-              </w:rPr>
               <w:t>June 29</w:t>
             </w:r>
           </w:p>
@@ -3590,13 +3385,8 @@
             <w:vAlign w:val="top"/>
           </w:tcPr>
           <w:p>
-            <w:r/>
             <w:r>
-              <w:rPr>
-                <w:b w:val="0"/>
-                <w:sz w:val="16"/>
-              </w:rPr>
-              <w:t>Submission metadata, author declarations, reviewer list, data availability statement, final PDF proof check.</w:t>
+              <w:t>Submission metadata, author declarations, suggested/opposed reviewers, cover letter, data availability statement, final PDF/DOCX proof, and journal-format checks.</w:t>
             </w:r>
           </w:p>
         </w:tc>
@@ -3608,12 +3398,7 @@
             <w:vAlign w:val="top"/>
           </w:tcPr>
           <w:p>
-            <w:r/>
             <w:r>
-              <w:rPr>
-                <w:b w:val="0"/>
-                <w:sz w:val="16"/>
-              </w:rPr>
               <w:t>June 30</w:t>
             </w:r>
           </w:p>
@@ -3624,13 +3409,8 @@
             <w:vAlign w:val="top"/>
           </w:tcPr>
           <w:p>
-            <w:r/>
             <w:r>
-              <w:rPr>
-                <w:b w:val="0"/>
-                <w:sz w:val="16"/>
-              </w:rPr>
-              <w:t>Submit. Do not add new data, features, or claims unless submission would otherwise contain an identified error.</w:t>
+              <w:t>Submit. After submission, no repository/article changes are part of the submitted record unless logged as post-submission corrections.</w:t>
             </w:r>
           </w:p>
         </w:tc>

</xml_diff>